<commit_message>
Act Directory sheet: confidence legend no longer says "read on India Code" (no page was opened); names table added; drops a reference to a folder that does not exist
Co-Authored-By: Claude Sonnet 5.5 <noreply@anthropic.com>
Claude-Session: https://claude.ai/code/session_01YEUNXbYb9LDbJLc2ziqL3n
</commit_message>
<xml_diff>
--- a/acts/ACT_DIRECTORY_SHEET.docx
+++ b/acts/ACT_DIRECTORY_SHEET.docx
@@ -46,7 +46,7 @@
         <w:t xml:space="preserve">Confidence column: </w:t>
       </w:r>
       <w:r>
-        <w:t>Claude's own confidence in its draft: certain (read on India Code or beyond doubt), likely (recollection of the law, please read with care), guessing (please rewrite).</w:t>
+        <w:t>Claude's own confidence in the status line (the appeal line carries its own in brackets): certain (the point appeared in India Code search results, or is beyond doubt), likely (recollection of the law, please read with care), guessing (please rewrite). No page was opened, so "certain" means "I saw no reason to doubt it", not "checked against the Act".</w:t>
       </w:r>
     </w:p>
     <w:tbl>
@@ -122,7 +122,7 @@
                 <w:b/>
                 <w:sz w:val="16"/>
               </w:rPr>
-              <w:t>Conf.</w:t>
+              <w:t>Conf. (status)</w:t>
             </w:r>
           </w:p>
         </w:tc>
@@ -4391,12 +4391,12 @@
         <w:pStyle w:val="Heading2"/>
       </w:pPr>
       <w:r>
-        <w:t>Phrases that make the site say “looks like it is about the … Act”</w:t>
+        <w:t>What makes the site show the notice</w:t>
       </w:r>
     </w:p>
     <w:p>
       <w:r>
-        <w:t>Besides the Act's name or its usual short forms, a few phrases that mean nothing else in practice also trigger the notice (worded “looks like it is about”, never “names”). Please strike any phrase that could reasonably mean something else.</w:t>
+        <w:t>Two kinds of trigger. (1) A NAME: the question contains the Act's name or one of the short forms in the middle column (the notice then says “This question names the … Act”). Ambiguous short forms such as CPC, HMA, NIA or “IT Act” are deliberately not used. (2) A PHRASE: a few phrases that mean nothing else in practice (the notice then says “looks like it is about”, never “names”). Please strike any name or phrase that could reasonably mean something else.</w:t>
       </w:r>
     </w:p>
     <w:tbl>
@@ -4406,13 +4406,14 @@
         <w:tblLook w:firstColumn="1" w:firstRow="1" w:lastColumn="0" w:lastRow="0" w:noHBand="0" w:noVBand="1" w:val="04A0"/>
       </w:tblPr>
       <w:tblGrid>
-        <w:gridCol w:w="7126"/>
-        <w:gridCol w:w="7126"/>
+        <w:gridCol w:w="4751"/>
+        <w:gridCol w:w="4751"/>
+        <w:gridCol w:w="4751"/>
       </w:tblGrid>
       <w:tr>
         <w:tc>
           <w:tcPr>
-            <w:tcW w:type="dxa" w:w="7126"/>
+            <w:tcW w:type="dxa" w:w="4751"/>
           </w:tcPr>
           <w:p>
             <w:r/>
@@ -4427,7 +4428,22 @@
         </w:tc>
         <w:tc>
           <w:tcPr>
-            <w:tcW w:type="dxa" w:w="7126"/>
+            <w:tcW w:type="dxa" w:w="4751"/>
+          </w:tcPr>
+          <w:p>
+            <w:r/>
+            <w:r>
+              <w:rPr>
+                <w:b/>
+                <w:sz w:val="16"/>
+              </w:rPr>
+              <w:t>Names and short forms (strike any that mislead)</w:t>
+            </w:r>
+          </w:p>
+        </w:tc>
+        <w:tc>
+          <w:tcPr>
+            <w:tcW w:type="dxa" w:w="4751"/>
           </w:tcPr>
           <w:p>
             <w:r/>
@@ -4444,7 +4460,7 @@
       <w:tr>
         <w:tc>
           <w:tcPr>
-            <w:tcW w:type="dxa" w:w="7126"/>
+            <w:tcW w:type="dxa" w:w="4751"/>
           </w:tcPr>
           <w:p>
             <w:r/>
@@ -4459,7 +4475,22 @@
         </w:tc>
         <w:tc>
           <w:tcPr>
-            <w:tcW w:type="dxa" w:w="7126"/>
+            <w:tcW w:type="dxa" w:w="4751"/>
+          </w:tcPr>
+          <w:p>
+            <w:r/>
+            <w:r>
+              <w:rPr>
+                <w:b w:val="0"/>
+                <w:sz w:val="16"/>
+              </w:rPr>
+              <w:t>prevention of corruption act; prevention of corruption amendment act; pc act; p.c. act</w:t>
+            </w:r>
+          </w:p>
+        </w:tc>
+        <w:tc>
+          <w:tcPr>
+            <w:tcW w:type="dxa" w:w="4751"/>
           </w:tcPr>
           <w:p>
             <w:r/>
@@ -4476,7 +4507,7 @@
       <w:tr>
         <w:tc>
           <w:tcPr>
-            <w:tcW w:type="dxa" w:w="7126"/>
+            <w:tcW w:type="dxa" w:w="4751"/>
           </w:tcPr>
           <w:p>
             <w:r/>
@@ -4491,7 +4522,22 @@
         </w:tc>
         <w:tc>
           <w:tcPr>
-            <w:tcW w:type="dxa" w:w="7126"/>
+            <w:tcW w:type="dxa" w:w="4751"/>
+          </w:tcPr>
+          <w:p>
+            <w:r/>
+            <w:r>
+              <w:rPr>
+                <w:b w:val="0"/>
+                <w:sz w:val="16"/>
+              </w:rPr>
+              <w:t>pmla; pml act; prevention of money laundering act</w:t>
+            </w:r>
+          </w:p>
+        </w:tc>
+        <w:tc>
+          <w:tcPr>
+            <w:tcW w:type="dxa" w:w="4751"/>
           </w:tcPr>
           <w:p>
             <w:r/>
@@ -4508,7 +4554,7 @@
       <w:tr>
         <w:tc>
           <w:tcPr>
-            <w:tcW w:type="dxa" w:w="7126"/>
+            <w:tcW w:type="dxa" w:w="4751"/>
           </w:tcPr>
           <w:p>
             <w:r/>
@@ -4523,7 +4569,22 @@
         </w:tc>
         <w:tc>
           <w:tcPr>
-            <w:tcW w:type="dxa" w:w="7126"/>
+            <w:tcW w:type="dxa" w:w="4751"/>
+          </w:tcPr>
+          <w:p>
+            <w:r/>
+            <w:r>
+              <w:rPr>
+                <w:b w:val="0"/>
+                <w:sz w:val="16"/>
+              </w:rPr>
+              <w:t>pocso; pocso act; protection of children from sexual offences act; protection of children from sexual offences</w:t>
+            </w:r>
+          </w:p>
+        </w:tc>
+        <w:tc>
+          <w:tcPr>
+            <w:tcW w:type="dxa" w:w="4751"/>
           </w:tcPr>
           <w:p>
             <w:r/>
@@ -4540,7 +4601,7 @@
       <w:tr>
         <w:tc>
           <w:tcPr>
-            <w:tcW w:type="dxa" w:w="7126"/>
+            <w:tcW w:type="dxa" w:w="4751"/>
           </w:tcPr>
           <w:p>
             <w:r/>
@@ -4555,7 +4616,22 @@
         </w:tc>
         <w:tc>
           <w:tcPr>
-            <w:tcW w:type="dxa" w:w="7126"/>
+            <w:tcW w:type="dxa" w:w="4751"/>
+          </w:tcPr>
+          <w:p>
+            <w:r/>
+            <w:r>
+              <w:rPr>
+                <w:b w:val="0"/>
+                <w:sz w:val="16"/>
+              </w:rPr>
+              <w:t>sc st act; sc st prevention of atrocities act; atrocities act; prevention of atrocities act; scheduled castes and scheduled tribes prevention of atrocities act; scheduled castes and the scheduled tribes prevention of atrocities act</w:t>
+            </w:r>
+          </w:p>
+        </w:tc>
+        <w:tc>
+          <w:tcPr>
+            <w:tcW w:type="dxa" w:w="4751"/>
           </w:tcPr>
           <w:p>
             <w:r/>
@@ -4572,31 +4648,46 @@
       <w:tr>
         <w:tc>
           <w:tcPr>
-            <w:tcW w:type="dxa" w:w="7126"/>
-          </w:tcPr>
-          <w:p>
-            <w:r/>
-            <w:r>
-              <w:rPr>
-                <w:b w:val="0"/>
-                <w:sz w:val="16"/>
-              </w:rPr>
-              <w:t>Consumer Protection Act, 2019</w:t>
-            </w:r>
-          </w:p>
-        </w:tc>
-        <w:tc>
-          <w:tcPr>
-            <w:tcW w:type="dxa" w:w="7126"/>
-          </w:tcPr>
-          <w:p>
-            <w:r/>
-            <w:r>
-              <w:rPr>
-                <w:b w:val="0"/>
-                <w:sz w:val="16"/>
-              </w:rPr>
-              <w:t>consumer court; consumer forum; consumer commission</w:t>
+            <w:tcW w:type="dxa" w:w="4751"/>
+          </w:tcPr>
+          <w:p>
+            <w:r/>
+            <w:r>
+              <w:rPr>
+                <w:b w:val="0"/>
+                <w:sz w:val="16"/>
+              </w:rPr>
+              <w:t>Unlawful Activities (Prevention) Act, 1967 (UAPA)</w:t>
+            </w:r>
+          </w:p>
+        </w:tc>
+        <w:tc>
+          <w:tcPr>
+            <w:tcW w:type="dxa" w:w="4751"/>
+          </w:tcPr>
+          <w:p>
+            <w:r/>
+            <w:r>
+              <w:rPr>
+                <w:b w:val="0"/>
+                <w:sz w:val="16"/>
+              </w:rPr>
+              <w:t>uapa; unlawful activities prevention act; unlawful activities prevention amendment act; u a p a</w:t>
+            </w:r>
+          </w:p>
+        </w:tc>
+        <w:tc>
+          <w:tcPr>
+            <w:tcW w:type="dxa" w:w="4751"/>
+          </w:tcPr>
+          <w:p>
+            <w:r/>
+            <w:r>
+              <w:rPr>
+                <w:b w:val="0"/>
+                <w:sz w:val="16"/>
+              </w:rPr>
+              <w:t>(none)</w:t>
             </w:r>
           </w:p>
         </w:tc>
@@ -4604,31 +4695,46 @@
       <w:tr>
         <w:tc>
           <w:tcPr>
-            <w:tcW w:type="dxa" w:w="7126"/>
-          </w:tcPr>
-          <w:p>
-            <w:r/>
-            <w:r>
-              <w:rPr>
-                <w:b w:val="0"/>
-                <w:sz w:val="16"/>
-              </w:rPr>
-              <w:t>Dowry Prohibition Act, 1961</w:t>
-            </w:r>
-          </w:p>
-        </w:tc>
-        <w:tc>
-          <w:tcPr>
-            <w:tcW w:type="dxa" w:w="7126"/>
-          </w:tcPr>
-          <w:p>
-            <w:r/>
-            <w:r>
-              <w:rPr>
-                <w:b w:val="0"/>
-                <w:sz w:val="16"/>
-              </w:rPr>
-              <w:t>dowry demand; dowry demands; demanded dowry; demanding dowry</w:t>
+            <w:tcW w:type="dxa" w:w="4751"/>
+          </w:tcPr>
+          <w:p>
+            <w:r/>
+            <w:r>
+              <w:rPr>
+                <w:b w:val="0"/>
+                <w:sz w:val="16"/>
+              </w:rPr>
+              <w:t>Arms Act, 1959</w:t>
+            </w:r>
+          </w:p>
+        </w:tc>
+        <w:tc>
+          <w:tcPr>
+            <w:tcW w:type="dxa" w:w="4751"/>
+          </w:tcPr>
+          <w:p>
+            <w:r/>
+            <w:r>
+              <w:rPr>
+                <w:b w:val="0"/>
+                <w:sz w:val="16"/>
+              </w:rPr>
+              <w:t>arms act</w:t>
+            </w:r>
+          </w:p>
+        </w:tc>
+        <w:tc>
+          <w:tcPr>
+            <w:tcW w:type="dxa" w:w="4751"/>
+          </w:tcPr>
+          <w:p>
+            <w:r/>
+            <w:r>
+              <w:rPr>
+                <w:b w:val="0"/>
+                <w:sz w:val="16"/>
+              </w:rPr>
+              <w:t>(none)</w:t>
             </w:r>
           </w:p>
         </w:tc>
@@ -4636,31 +4742,46 @@
       <w:tr>
         <w:tc>
           <w:tcPr>
-            <w:tcW w:type="dxa" w:w="7126"/>
-          </w:tcPr>
-          <w:p>
-            <w:r/>
-            <w:r>
-              <w:rPr>
-                <w:b w:val="0"/>
-                <w:sz w:val="16"/>
-              </w:rPr>
-              <w:t>Juvenile Justice (Care and Protection of Children) Act, 2015</w:t>
-            </w:r>
-          </w:p>
-        </w:tc>
-        <w:tc>
-          <w:tcPr>
-            <w:tcW w:type="dxa" w:w="7126"/>
-          </w:tcPr>
-          <w:p>
-            <w:r/>
-            <w:r>
-              <w:rPr>
-                <w:b w:val="0"/>
-                <w:sz w:val="16"/>
-              </w:rPr>
-              <w:t>juvenile justice board; juvenile in conflict with law; child in conflict with law</w:t>
+            <w:tcW w:type="dxa" w:w="4751"/>
+          </w:tcPr>
+          <w:p>
+            <w:r/>
+            <w:r>
+              <w:rPr>
+                <w:b w:val="0"/>
+                <w:sz w:val="16"/>
+              </w:rPr>
+              <w:t>Bharatiya Sakshya Adhiniyam, 2023</w:t>
+            </w:r>
+          </w:p>
+        </w:tc>
+        <w:tc>
+          <w:tcPr>
+            <w:tcW w:type="dxa" w:w="4751"/>
+          </w:tcPr>
+          <w:p>
+            <w:r/>
+            <w:r>
+              <w:rPr>
+                <w:b w:val="0"/>
+                <w:sz w:val="16"/>
+              </w:rPr>
+              <w:t>bharatiya sakshya adhiniyam; bharatiya sakshya; bsa 2023; bsa</w:t>
+            </w:r>
+          </w:p>
+        </w:tc>
+        <w:tc>
+          <w:tcPr>
+            <w:tcW w:type="dxa" w:w="4751"/>
+          </w:tcPr>
+          <w:p>
+            <w:r/>
+            <w:r>
+              <w:rPr>
+                <w:b w:val="0"/>
+                <w:sz w:val="16"/>
+              </w:rPr>
+              <w:t>(none)</w:t>
             </w:r>
           </w:p>
         </w:tc>
@@ -4668,31 +4789,46 @@
       <w:tr>
         <w:tc>
           <w:tcPr>
-            <w:tcW w:type="dxa" w:w="7126"/>
-          </w:tcPr>
-          <w:p>
-            <w:r/>
-            <w:r>
-              <w:rPr>
-                <w:b w:val="0"/>
-                <w:sz w:val="16"/>
-              </w:rPr>
-              <w:t>Motor Vehicles Act, 1988</w:t>
-            </w:r>
-          </w:p>
-        </w:tc>
-        <w:tc>
-          <w:tcPr>
-            <w:tcW w:type="dxa" w:w="7126"/>
-          </w:tcPr>
-          <w:p>
-            <w:r/>
-            <w:r>
-              <w:rPr>
-                <w:b w:val="0"/>
-                <w:sz w:val="16"/>
-              </w:rPr>
-              <w:t>drunk driving; drunken driving; drink and drive; motor accident claims tribunal</w:t>
+            <w:tcW w:type="dxa" w:w="4751"/>
+          </w:tcPr>
+          <w:p>
+            <w:r/>
+            <w:r>
+              <w:rPr>
+                <w:b w:val="0"/>
+                <w:sz w:val="16"/>
+              </w:rPr>
+              <w:t>Central Goods and Services Tax Act, 2017 (CGST)</w:t>
+            </w:r>
+          </w:p>
+        </w:tc>
+        <w:tc>
+          <w:tcPr>
+            <w:tcW w:type="dxa" w:w="4751"/>
+          </w:tcPr>
+          <w:p>
+            <w:r/>
+            <w:r>
+              <w:rPr>
+                <w:b w:val="0"/>
+                <w:sz w:val="16"/>
+              </w:rPr>
+              <w:t>cgst act; central goods and services tax act; cgst</w:t>
+            </w:r>
+          </w:p>
+        </w:tc>
+        <w:tc>
+          <w:tcPr>
+            <w:tcW w:type="dxa" w:w="4751"/>
+          </w:tcPr>
+          <w:p>
+            <w:r/>
+            <w:r>
+              <w:rPr>
+                <w:b w:val="0"/>
+                <w:sz w:val="16"/>
+              </w:rPr>
+              <w:t>(none)</w:t>
             </w:r>
           </w:p>
         </w:tc>
@@ -4700,7 +4836,806 @@
       <w:tr>
         <w:tc>
           <w:tcPr>
-            <w:tcW w:type="dxa" w:w="7126"/>
+            <w:tcW w:type="dxa" w:w="4751"/>
+          </w:tcPr>
+          <w:p>
+            <w:r/>
+            <w:r>
+              <w:rPr>
+                <w:b w:val="0"/>
+                <w:sz w:val="16"/>
+              </w:rPr>
+              <w:t>Code of Civil Procedure, 1908</w:t>
+            </w:r>
+          </w:p>
+        </w:tc>
+        <w:tc>
+          <w:tcPr>
+            <w:tcW w:type="dxa" w:w="4751"/>
+          </w:tcPr>
+          <w:p>
+            <w:r/>
+            <w:r>
+              <w:rPr>
+                <w:b w:val="0"/>
+                <w:sz w:val="16"/>
+              </w:rPr>
+              <w:t>code of civil procedure</w:t>
+            </w:r>
+          </w:p>
+        </w:tc>
+        <w:tc>
+          <w:tcPr>
+            <w:tcW w:type="dxa" w:w="4751"/>
+          </w:tcPr>
+          <w:p>
+            <w:r/>
+            <w:r>
+              <w:rPr>
+                <w:b w:val="0"/>
+                <w:sz w:val="16"/>
+              </w:rPr>
+              <w:t>(none)</w:t>
+            </w:r>
+          </w:p>
+        </w:tc>
+      </w:tr>
+      <w:tr>
+        <w:tc>
+          <w:tcPr>
+            <w:tcW w:type="dxa" w:w="4751"/>
+          </w:tcPr>
+          <w:p>
+            <w:r/>
+            <w:r>
+              <w:rPr>
+                <w:b w:val="0"/>
+                <w:sz w:val="16"/>
+              </w:rPr>
+              <w:t>Companies Act, 2013</w:t>
+            </w:r>
+          </w:p>
+        </w:tc>
+        <w:tc>
+          <w:tcPr>
+            <w:tcW w:type="dxa" w:w="4751"/>
+          </w:tcPr>
+          <w:p>
+            <w:r/>
+            <w:r>
+              <w:rPr>
+                <w:b w:val="0"/>
+                <w:sz w:val="16"/>
+              </w:rPr>
+              <w:t>companies act</w:t>
+            </w:r>
+          </w:p>
+        </w:tc>
+        <w:tc>
+          <w:tcPr>
+            <w:tcW w:type="dxa" w:w="4751"/>
+          </w:tcPr>
+          <w:p>
+            <w:r/>
+            <w:r>
+              <w:rPr>
+                <w:b w:val="0"/>
+                <w:sz w:val="16"/>
+              </w:rPr>
+              <w:t>(none)</w:t>
+            </w:r>
+          </w:p>
+        </w:tc>
+      </w:tr>
+      <w:tr>
+        <w:tc>
+          <w:tcPr>
+            <w:tcW w:type="dxa" w:w="4751"/>
+          </w:tcPr>
+          <w:p>
+            <w:r/>
+            <w:r>
+              <w:rPr>
+                <w:b w:val="0"/>
+                <w:sz w:val="16"/>
+              </w:rPr>
+              <w:t>Consumer Protection Act, 2019</w:t>
+            </w:r>
+          </w:p>
+        </w:tc>
+        <w:tc>
+          <w:tcPr>
+            <w:tcW w:type="dxa" w:w="4751"/>
+          </w:tcPr>
+          <w:p>
+            <w:r/>
+            <w:r>
+              <w:rPr>
+                <w:b w:val="0"/>
+                <w:sz w:val="16"/>
+              </w:rPr>
+              <w:t>consumer protection act</w:t>
+            </w:r>
+          </w:p>
+        </w:tc>
+        <w:tc>
+          <w:tcPr>
+            <w:tcW w:type="dxa" w:w="4751"/>
+          </w:tcPr>
+          <w:p>
+            <w:r/>
+            <w:r>
+              <w:rPr>
+                <w:b w:val="0"/>
+                <w:sz w:val="16"/>
+              </w:rPr>
+              <w:t>consumer court; consumer forum; consumer commission</w:t>
+            </w:r>
+          </w:p>
+        </w:tc>
+      </w:tr>
+      <w:tr>
+        <w:tc>
+          <w:tcPr>
+            <w:tcW w:type="dxa" w:w="4751"/>
+          </w:tcPr>
+          <w:p>
+            <w:r/>
+            <w:r>
+              <w:rPr>
+                <w:b w:val="0"/>
+                <w:sz w:val="16"/>
+              </w:rPr>
+              <w:t>Customs Act, 1962</w:t>
+            </w:r>
+          </w:p>
+        </w:tc>
+        <w:tc>
+          <w:tcPr>
+            <w:tcW w:type="dxa" w:w="4751"/>
+          </w:tcPr>
+          <w:p>
+            <w:r/>
+            <w:r>
+              <w:rPr>
+                <w:b w:val="0"/>
+                <w:sz w:val="16"/>
+              </w:rPr>
+              <w:t>customs act</w:t>
+            </w:r>
+          </w:p>
+        </w:tc>
+        <w:tc>
+          <w:tcPr>
+            <w:tcW w:type="dxa" w:w="4751"/>
+          </w:tcPr>
+          <w:p>
+            <w:r/>
+            <w:r>
+              <w:rPr>
+                <w:b w:val="0"/>
+                <w:sz w:val="16"/>
+              </w:rPr>
+              <w:t>(none)</w:t>
+            </w:r>
+          </w:p>
+        </w:tc>
+      </w:tr>
+      <w:tr>
+        <w:tc>
+          <w:tcPr>
+            <w:tcW w:type="dxa" w:w="4751"/>
+          </w:tcPr>
+          <w:p>
+            <w:r/>
+            <w:r>
+              <w:rPr>
+                <w:b w:val="0"/>
+                <w:sz w:val="16"/>
+              </w:rPr>
+              <w:t>Dowry Prohibition Act, 1961</w:t>
+            </w:r>
+          </w:p>
+        </w:tc>
+        <w:tc>
+          <w:tcPr>
+            <w:tcW w:type="dxa" w:w="4751"/>
+          </w:tcPr>
+          <w:p>
+            <w:r/>
+            <w:r>
+              <w:rPr>
+                <w:b w:val="0"/>
+                <w:sz w:val="16"/>
+              </w:rPr>
+              <w:t>dowry prohibition act; dowry act</w:t>
+            </w:r>
+          </w:p>
+        </w:tc>
+        <w:tc>
+          <w:tcPr>
+            <w:tcW w:type="dxa" w:w="4751"/>
+          </w:tcPr>
+          <w:p>
+            <w:r/>
+            <w:r>
+              <w:rPr>
+                <w:b w:val="0"/>
+                <w:sz w:val="16"/>
+              </w:rPr>
+              <w:t>dowry demand; dowry demands; demanded dowry; demanding dowry</w:t>
+            </w:r>
+          </w:p>
+        </w:tc>
+      </w:tr>
+      <w:tr>
+        <w:tc>
+          <w:tcPr>
+            <w:tcW w:type="dxa" w:w="4751"/>
+          </w:tcPr>
+          <w:p>
+            <w:r/>
+            <w:r>
+              <w:rPr>
+                <w:b w:val="0"/>
+                <w:sz w:val="16"/>
+              </w:rPr>
+              <w:t>Essential Commodities Act, 1955</w:t>
+            </w:r>
+          </w:p>
+        </w:tc>
+        <w:tc>
+          <w:tcPr>
+            <w:tcW w:type="dxa" w:w="4751"/>
+          </w:tcPr>
+          <w:p>
+            <w:r/>
+            <w:r>
+              <w:rPr>
+                <w:b w:val="0"/>
+                <w:sz w:val="16"/>
+              </w:rPr>
+              <w:t>essential commodities act</w:t>
+            </w:r>
+          </w:p>
+        </w:tc>
+        <w:tc>
+          <w:tcPr>
+            <w:tcW w:type="dxa" w:w="4751"/>
+          </w:tcPr>
+          <w:p>
+            <w:r/>
+            <w:r>
+              <w:rPr>
+                <w:b w:val="0"/>
+                <w:sz w:val="16"/>
+              </w:rPr>
+              <w:t>(none)</w:t>
+            </w:r>
+          </w:p>
+        </w:tc>
+      </w:tr>
+      <w:tr>
+        <w:tc>
+          <w:tcPr>
+            <w:tcW w:type="dxa" w:w="4751"/>
+          </w:tcPr>
+          <w:p>
+            <w:r/>
+            <w:r>
+              <w:rPr>
+                <w:b w:val="0"/>
+                <w:sz w:val="16"/>
+              </w:rPr>
+              <w:t>Hindu Marriage Act, 1955</w:t>
+            </w:r>
+          </w:p>
+        </w:tc>
+        <w:tc>
+          <w:tcPr>
+            <w:tcW w:type="dxa" w:w="4751"/>
+          </w:tcPr>
+          <w:p>
+            <w:r/>
+            <w:r>
+              <w:rPr>
+                <w:b w:val="0"/>
+                <w:sz w:val="16"/>
+              </w:rPr>
+              <w:t>hindu marriage act</w:t>
+            </w:r>
+          </w:p>
+        </w:tc>
+        <w:tc>
+          <w:tcPr>
+            <w:tcW w:type="dxa" w:w="4751"/>
+          </w:tcPr>
+          <w:p>
+            <w:r/>
+            <w:r>
+              <w:rPr>
+                <w:b w:val="0"/>
+                <w:sz w:val="16"/>
+              </w:rPr>
+              <w:t>(none)</w:t>
+            </w:r>
+          </w:p>
+        </w:tc>
+      </w:tr>
+      <w:tr>
+        <w:tc>
+          <w:tcPr>
+            <w:tcW w:type="dxa" w:w="4751"/>
+          </w:tcPr>
+          <w:p>
+            <w:r/>
+            <w:r>
+              <w:rPr>
+                <w:b w:val="0"/>
+                <w:sz w:val="16"/>
+              </w:rPr>
+              <w:t>Hindu Succession Act, 1956</w:t>
+            </w:r>
+          </w:p>
+        </w:tc>
+        <w:tc>
+          <w:tcPr>
+            <w:tcW w:type="dxa" w:w="4751"/>
+          </w:tcPr>
+          <w:p>
+            <w:r/>
+            <w:r>
+              <w:rPr>
+                <w:b w:val="0"/>
+                <w:sz w:val="16"/>
+              </w:rPr>
+              <w:t>hindu succession act</w:t>
+            </w:r>
+          </w:p>
+        </w:tc>
+        <w:tc>
+          <w:tcPr>
+            <w:tcW w:type="dxa" w:w="4751"/>
+          </w:tcPr>
+          <w:p>
+            <w:r/>
+            <w:r>
+              <w:rPr>
+                <w:b w:val="0"/>
+                <w:sz w:val="16"/>
+              </w:rPr>
+              <w:t>(none)</w:t>
+            </w:r>
+          </w:p>
+        </w:tc>
+      </w:tr>
+      <w:tr>
+        <w:tc>
+          <w:tcPr>
+            <w:tcW w:type="dxa" w:w="4751"/>
+          </w:tcPr>
+          <w:p>
+            <w:r/>
+            <w:r>
+              <w:rPr>
+                <w:b w:val="0"/>
+                <w:sz w:val="16"/>
+              </w:rPr>
+              <w:t>Immoral Traffic (Prevention) Act, 1956</w:t>
+            </w:r>
+          </w:p>
+        </w:tc>
+        <w:tc>
+          <w:tcPr>
+            <w:tcW w:type="dxa" w:w="4751"/>
+          </w:tcPr>
+          <w:p>
+            <w:r/>
+            <w:r>
+              <w:rPr>
+                <w:b w:val="0"/>
+                <w:sz w:val="16"/>
+              </w:rPr>
+              <w:t>immoral traffic prevention act; prevention of immoral traffic act; itpa; suppression of immoral traffic in women and girls act</w:t>
+            </w:r>
+          </w:p>
+        </w:tc>
+        <w:tc>
+          <w:tcPr>
+            <w:tcW w:type="dxa" w:w="4751"/>
+          </w:tcPr>
+          <w:p>
+            <w:r/>
+            <w:r>
+              <w:rPr>
+                <w:b w:val="0"/>
+                <w:sz w:val="16"/>
+              </w:rPr>
+              <w:t>(none)</w:t>
+            </w:r>
+          </w:p>
+        </w:tc>
+      </w:tr>
+      <w:tr>
+        <w:tc>
+          <w:tcPr>
+            <w:tcW w:type="dxa" w:w="4751"/>
+          </w:tcPr>
+          <w:p>
+            <w:r/>
+            <w:r>
+              <w:rPr>
+                <w:b w:val="0"/>
+                <w:sz w:val="16"/>
+              </w:rPr>
+              <w:t>Income-tax Act, 1961</w:t>
+            </w:r>
+          </w:p>
+        </w:tc>
+        <w:tc>
+          <w:tcPr>
+            <w:tcW w:type="dxa" w:w="4751"/>
+          </w:tcPr>
+          <w:p>
+            <w:r/>
+            <w:r>
+              <w:rPr>
+                <w:b w:val="0"/>
+                <w:sz w:val="16"/>
+              </w:rPr>
+              <w:t>income tax act</w:t>
+            </w:r>
+          </w:p>
+        </w:tc>
+        <w:tc>
+          <w:tcPr>
+            <w:tcW w:type="dxa" w:w="4751"/>
+          </w:tcPr>
+          <w:p>
+            <w:r/>
+            <w:r>
+              <w:rPr>
+                <w:b w:val="0"/>
+                <w:sz w:val="16"/>
+              </w:rPr>
+              <w:t>(none)</w:t>
+            </w:r>
+          </w:p>
+        </w:tc>
+      </w:tr>
+      <w:tr>
+        <w:tc>
+          <w:tcPr>
+            <w:tcW w:type="dxa" w:w="4751"/>
+          </w:tcPr>
+          <w:p>
+            <w:r/>
+            <w:r>
+              <w:rPr>
+                <w:b w:val="0"/>
+                <w:sz w:val="16"/>
+              </w:rPr>
+              <w:t>Indian Contract Act, 1872</w:t>
+            </w:r>
+          </w:p>
+        </w:tc>
+        <w:tc>
+          <w:tcPr>
+            <w:tcW w:type="dxa" w:w="4751"/>
+          </w:tcPr>
+          <w:p>
+            <w:r/>
+            <w:r>
+              <w:rPr>
+                <w:b w:val="0"/>
+                <w:sz w:val="16"/>
+              </w:rPr>
+              <w:t>indian contract act; contract act</w:t>
+            </w:r>
+          </w:p>
+        </w:tc>
+        <w:tc>
+          <w:tcPr>
+            <w:tcW w:type="dxa" w:w="4751"/>
+          </w:tcPr>
+          <w:p>
+            <w:r/>
+            <w:r>
+              <w:rPr>
+                <w:b w:val="0"/>
+                <w:sz w:val="16"/>
+              </w:rPr>
+              <w:t>(none)</w:t>
+            </w:r>
+          </w:p>
+        </w:tc>
+      </w:tr>
+      <w:tr>
+        <w:tc>
+          <w:tcPr>
+            <w:tcW w:type="dxa" w:w="4751"/>
+          </w:tcPr>
+          <w:p>
+            <w:r/>
+            <w:r>
+              <w:rPr>
+                <w:b w:val="0"/>
+                <w:sz w:val="16"/>
+              </w:rPr>
+              <w:t>Indian Evidence Act, 1872</w:t>
+            </w:r>
+          </w:p>
+        </w:tc>
+        <w:tc>
+          <w:tcPr>
+            <w:tcW w:type="dxa" w:w="4751"/>
+          </w:tcPr>
+          <w:p>
+            <w:r/>
+            <w:r>
+              <w:rPr>
+                <w:b w:val="0"/>
+                <w:sz w:val="16"/>
+              </w:rPr>
+              <w:t>indian evidence act; evidence act</w:t>
+            </w:r>
+          </w:p>
+        </w:tc>
+        <w:tc>
+          <w:tcPr>
+            <w:tcW w:type="dxa" w:w="4751"/>
+          </w:tcPr>
+          <w:p>
+            <w:r/>
+            <w:r>
+              <w:rPr>
+                <w:b w:val="0"/>
+                <w:sz w:val="16"/>
+              </w:rPr>
+              <w:t>(none)</w:t>
+            </w:r>
+          </w:p>
+        </w:tc>
+      </w:tr>
+      <w:tr>
+        <w:tc>
+          <w:tcPr>
+            <w:tcW w:type="dxa" w:w="4751"/>
+          </w:tcPr>
+          <w:p>
+            <w:r/>
+            <w:r>
+              <w:rPr>
+                <w:b w:val="0"/>
+                <w:sz w:val="16"/>
+              </w:rPr>
+              <w:t>Juvenile Justice (Care and Protection of Children) Act, 2015</w:t>
+            </w:r>
+          </w:p>
+        </w:tc>
+        <w:tc>
+          <w:tcPr>
+            <w:tcW w:type="dxa" w:w="4751"/>
+          </w:tcPr>
+          <w:p>
+            <w:r/>
+            <w:r>
+              <w:rPr>
+                <w:b w:val="0"/>
+                <w:sz w:val="16"/>
+              </w:rPr>
+              <w:t>juvenile justice act; juvenile justice care and protection of children act; jj act; j j act</w:t>
+            </w:r>
+          </w:p>
+        </w:tc>
+        <w:tc>
+          <w:tcPr>
+            <w:tcW w:type="dxa" w:w="4751"/>
+          </w:tcPr>
+          <w:p>
+            <w:r/>
+            <w:r>
+              <w:rPr>
+                <w:b w:val="0"/>
+                <w:sz w:val="16"/>
+              </w:rPr>
+              <w:t>juvenile justice board; juvenile in conflict with law; child in conflict with law</w:t>
+            </w:r>
+          </w:p>
+        </w:tc>
+      </w:tr>
+      <w:tr>
+        <w:tc>
+          <w:tcPr>
+            <w:tcW w:type="dxa" w:w="4751"/>
+          </w:tcPr>
+          <w:p>
+            <w:r/>
+            <w:r>
+              <w:rPr>
+                <w:b w:val="0"/>
+                <w:sz w:val="16"/>
+              </w:rPr>
+              <w:t>Limitation Act, 1963</w:t>
+            </w:r>
+          </w:p>
+        </w:tc>
+        <w:tc>
+          <w:tcPr>
+            <w:tcW w:type="dxa" w:w="4751"/>
+          </w:tcPr>
+          <w:p>
+            <w:r/>
+            <w:r>
+              <w:rPr>
+                <w:b w:val="0"/>
+                <w:sz w:val="16"/>
+              </w:rPr>
+              <w:t>limitation act</w:t>
+            </w:r>
+          </w:p>
+        </w:tc>
+        <w:tc>
+          <w:tcPr>
+            <w:tcW w:type="dxa" w:w="4751"/>
+          </w:tcPr>
+          <w:p>
+            <w:r/>
+            <w:r>
+              <w:rPr>
+                <w:b w:val="0"/>
+                <w:sz w:val="16"/>
+              </w:rPr>
+              <w:t>(none)</w:t>
+            </w:r>
+          </w:p>
+        </w:tc>
+      </w:tr>
+      <w:tr>
+        <w:tc>
+          <w:tcPr>
+            <w:tcW w:type="dxa" w:w="4751"/>
+          </w:tcPr>
+          <w:p>
+            <w:r/>
+            <w:r>
+              <w:rPr>
+                <w:b w:val="0"/>
+                <w:sz w:val="16"/>
+              </w:rPr>
+              <w:t>Maintenance and Welfare of Parents and Senior Citizens Act, 2007</w:t>
+            </w:r>
+          </w:p>
+        </w:tc>
+        <w:tc>
+          <w:tcPr>
+            <w:tcW w:type="dxa" w:w="4751"/>
+          </w:tcPr>
+          <w:p>
+            <w:r/>
+            <w:r>
+              <w:rPr>
+                <w:b w:val="0"/>
+                <w:sz w:val="16"/>
+              </w:rPr>
+              <w:t>senior citizens act; maintenance and welfare of parents and senior citizens act; parents and senior citizens act</w:t>
+            </w:r>
+          </w:p>
+        </w:tc>
+        <w:tc>
+          <w:tcPr>
+            <w:tcW w:type="dxa" w:w="4751"/>
+          </w:tcPr>
+          <w:p>
+            <w:r/>
+            <w:r>
+              <w:rPr>
+                <w:b w:val="0"/>
+                <w:sz w:val="16"/>
+              </w:rPr>
+              <w:t>(none)</w:t>
+            </w:r>
+          </w:p>
+        </w:tc>
+      </w:tr>
+      <w:tr>
+        <w:tc>
+          <w:tcPr>
+            <w:tcW w:type="dxa" w:w="4751"/>
+          </w:tcPr>
+          <w:p>
+            <w:r/>
+            <w:r>
+              <w:rPr>
+                <w:b w:val="0"/>
+                <w:sz w:val="16"/>
+              </w:rPr>
+              <w:t>Motor Vehicles Act, 1988</w:t>
+            </w:r>
+          </w:p>
+        </w:tc>
+        <w:tc>
+          <w:tcPr>
+            <w:tcW w:type="dxa" w:w="4751"/>
+          </w:tcPr>
+          <w:p>
+            <w:r/>
+            <w:r>
+              <w:rPr>
+                <w:b w:val="0"/>
+                <w:sz w:val="16"/>
+              </w:rPr>
+              <w:t>motor vehicles act; motor vehicle act; mv act; m v act</w:t>
+            </w:r>
+          </w:p>
+        </w:tc>
+        <w:tc>
+          <w:tcPr>
+            <w:tcW w:type="dxa" w:w="4751"/>
+          </w:tcPr>
+          <w:p>
+            <w:r/>
+            <w:r>
+              <w:rPr>
+                <w:b w:val="0"/>
+                <w:sz w:val="16"/>
+              </w:rPr>
+              <w:t>drunk driving; drunken driving; drink and drive; motor accident claims tribunal</w:t>
+            </w:r>
+          </w:p>
+        </w:tc>
+      </w:tr>
+      <w:tr>
+        <w:tc>
+          <w:tcPr>
+            <w:tcW w:type="dxa" w:w="4751"/>
+          </w:tcPr>
+          <w:p>
+            <w:r/>
+            <w:r>
+              <w:rPr>
+                <w:b w:val="0"/>
+                <w:sz w:val="16"/>
+              </w:rPr>
+              <w:t>National Investigation Agency Act, 2008</w:t>
+            </w:r>
+          </w:p>
+        </w:tc>
+        <w:tc>
+          <w:tcPr>
+            <w:tcW w:type="dxa" w:w="4751"/>
+          </w:tcPr>
+          <w:p>
+            <w:r/>
+            <w:r>
+              <w:rPr>
+                <w:b w:val="0"/>
+                <w:sz w:val="16"/>
+              </w:rPr>
+              <w:t>nia act; national investigation agency act</w:t>
+            </w:r>
+          </w:p>
+        </w:tc>
+        <w:tc>
+          <w:tcPr>
+            <w:tcW w:type="dxa" w:w="4751"/>
+          </w:tcPr>
+          <w:p>
+            <w:r/>
+            <w:r>
+              <w:rPr>
+                <w:b w:val="0"/>
+                <w:sz w:val="16"/>
+              </w:rPr>
+              <w:t>(none)</w:t>
+            </w:r>
+          </w:p>
+        </w:tc>
+      </w:tr>
+      <w:tr>
+        <w:tc>
+          <w:tcPr>
+            <w:tcW w:type="dxa" w:w="4751"/>
           </w:tcPr>
           <w:p>
             <w:r/>
@@ -4715,7 +5650,22 @@
         </w:tc>
         <w:tc>
           <w:tcPr>
-            <w:tcW w:type="dxa" w:w="7126"/>
+            <w:tcW w:type="dxa" w:w="4751"/>
+          </w:tcPr>
+          <w:p>
+            <w:r/>
+            <w:r>
+              <w:rPr>
+                <w:b w:val="0"/>
+                <w:sz w:val="16"/>
+              </w:rPr>
+              <w:t>posh act; sexual harassment of women at workplace act; sexual harassment of women at workplace prevention prohibition and redressal act</w:t>
+            </w:r>
+          </w:p>
+        </w:tc>
+        <w:tc>
+          <w:tcPr>
+            <w:tcW w:type="dxa" w:w="4751"/>
           </w:tcPr>
           <w:p>
             <w:r/>
@@ -4725,17 +5675,106 @@
                 <w:sz w:val="16"/>
               </w:rPr>
               <w:t>internal complaints committee; local complaints committee</w:t>
+            </w:r>
+          </w:p>
+        </w:tc>
+      </w:tr>
+      <w:tr>
+        <w:tc>
+          <w:tcPr>
+            <w:tcW w:type="dxa" w:w="4751"/>
+          </w:tcPr>
+          <w:p>
+            <w:r/>
+            <w:r>
+              <w:rPr>
+                <w:b w:val="0"/>
+                <w:sz w:val="16"/>
+              </w:rPr>
+              <w:t>Terrorist and Disruptive Activities (Prevention) Act, 1987 (TADA)</w:t>
+            </w:r>
+          </w:p>
+        </w:tc>
+        <w:tc>
+          <w:tcPr>
+            <w:tcW w:type="dxa" w:w="4751"/>
+          </w:tcPr>
+          <w:p>
+            <w:r/>
+            <w:r>
+              <w:rPr>
+                <w:b w:val="0"/>
+                <w:sz w:val="16"/>
+              </w:rPr>
+              <w:t>tada; terrorist and disruptive activities prevention act</w:t>
+            </w:r>
+          </w:p>
+        </w:tc>
+        <w:tc>
+          <w:tcPr>
+            <w:tcW w:type="dxa" w:w="4751"/>
+          </w:tcPr>
+          <w:p>
+            <w:r/>
+            <w:r>
+              <w:rPr>
+                <w:b w:val="0"/>
+                <w:sz w:val="16"/>
+              </w:rPr>
+              <w:t>(none)</w:t>
+            </w:r>
+          </w:p>
+        </w:tc>
+      </w:tr>
+      <w:tr>
+        <w:tc>
+          <w:tcPr>
+            <w:tcW w:type="dxa" w:w="4751"/>
+          </w:tcPr>
+          <w:p>
+            <w:r/>
+            <w:r>
+              <w:rPr>
+                <w:b w:val="0"/>
+                <w:sz w:val="16"/>
+              </w:rPr>
+              <w:t>Transfer of Property Act, 1882</w:t>
+            </w:r>
+          </w:p>
+        </w:tc>
+        <w:tc>
+          <w:tcPr>
+            <w:tcW w:type="dxa" w:w="4751"/>
+          </w:tcPr>
+          <w:p>
+            <w:r/>
+            <w:r>
+              <w:rPr>
+                <w:b w:val="0"/>
+                <w:sz w:val="16"/>
+              </w:rPr>
+              <w:t>transfer of property act</w:t>
+            </w:r>
+          </w:p>
+        </w:tc>
+        <w:tc>
+          <w:tcPr>
+            <w:tcW w:type="dxa" w:w="4751"/>
+          </w:tcPr>
+          <w:p>
+            <w:r/>
+            <w:r>
+              <w:rPr>
+                <w:b w:val="0"/>
+                <w:sz w:val="16"/>
+              </w:rPr>
+              <w:t>(none)</w:t>
             </w:r>
           </w:p>
         </w:tc>
       </w:tr>
     </w:tbl>
     <w:p/>
-    <w:p>
-      <w:r>
-        <w:t>Short names the site recognises for an Act (it never uses an ambiguous short form such as CPC, HMA, NIA or “IT Act”): see the aliases in acts_directory.json; the full list is in the drafts folder and can be read out on request.</w:t>
-      </w:r>
-    </w:p>
     <w:p>
       <w:r>
         <w:t>Please send the sheet back (a photo of a marked printout is fine). Claude records only what you confirm; an unconfirmed row stays hidden.</w:t>

</xml_diff>

<commit_message>
Docs, sheet and patch copies for the four added Directory Acts (34 rows)
Co-Authored-By: Claude Sonnet 5.5 <noreply@anthropic.com>
Claude-Session: https://claude.ai/code/session_01YEUNXbYb9LDbJLc2ziqL3n
</commit_message>
<xml_diff>
--- a/acts/ACT_DIRECTORY_SHEET.docx
+++ b/acts/ACT_DIRECTORY_SHEET.docx
@@ -3952,9 +3952,9 @@
                 <w:b w:val="0"/>
                 <w:sz w:val="16"/>
               </w:rPr>
-              <w:t>The National Investigation Agency Act, 2008</w:t>
+              <w:t>The Muslim Women (Protection of Rights on Marriage) Act, 2019</w:t>
               <w:br/>
-              <w:t>Act 34 of 2008</w:t>
+              <w:t>Act 20 of 2019</w:t>
             </w:r>
           </w:p>
           <w:p>
@@ -3964,7 +3964,7 @@
                 <w:color w:val="555555"/>
                 <w:sz w:val="14"/>
               </w:rPr>
-              <w:t>India Code's own record: "The National Investigation Agency Act, 2008"; not marked repealed; enforcement date 31-12-2008.</w:t>
+              <w:t>India Code's own record: "The Muslim Women (Protection of Rights on Marriage) Act, 2019."; not marked repealed; enforcement date 19-9-2018.</w:t>
             </w:r>
           </w:p>
         </w:tc>
@@ -3979,7 +3979,7 @@
                 <w:b w:val="0"/>
                 <w:sz w:val="16"/>
               </w:rPr>
-              <w:t>In force. Amended in 2019 (India Code's footnote to section 22 cites Act 16 of 2019, from 2 August 2019).</w:t>
+              <w:t>In force since 19 September 2018 (section 1(3) says the Act is deemed to have come into force on that day). It replaced the Muslim Women (Protection of Rights on Marriage) Second Ordinance, 2019. Since 30 October 2019 it also applies in the Union territories of Jammu and Kashmir and Ladakh.</w:t>
             </w:r>
           </w:p>
           <w:p>
@@ -3989,7 +3989,7 @@
                 <w:color w:val="555555"/>
                 <w:sz w:val="14"/>
               </w:rPr>
-              <w:t>What was read: India Code, read 2026-10-16: not marked repealed; its amendment list names the National Investigation Agency (Amendment) Act, 2019; the footnote to section 22 cites Act 16 of 2019 w.e.f. 2-8-2019.</w:t>
+              <w:t>What was read: India Code, read 2026-10-17: section 1(3) deems the Act in force on the 19th day of September, 2018, and India Code gives the enforcement date 19-9-2018; not marked repealed; section 8 repeals the Second Ordinance, 2019 (Ord. 4 of 2019); footnote to section 1: Notification S.O. 3912 (E) of 30 October 2019 makes the Act applicable to the Union territories of Jammu and Kashmir and Ladakh. The Act has no appeal section of its own (sections 1 to 8 read), so no appeal line is drafted.</w:t>
             </w:r>
           </w:p>
         </w:tc>
@@ -4019,23 +4019,7 @@
                 <w:b w:val="0"/>
                 <w:sz w:val="16"/>
               </w:rPr>
-              <w:t>An appeal lies from any judgment, sentence or order (other than an interlocutory order) of a Special Court to the High Court, on facts and on law, heard by a bench of two Judges, within 30 days (the High Court may allow up to 90). An order granting or refusing bail is also appealable to the High Court (section 21).</w:t>
-            </w:r>
-            <w:r>
-              <w:rPr>
-                <w:sz w:val="16"/>
-              </w:rPr>
-              <w:t xml:space="preserve"> [certain]</w:t>
-            </w:r>
-          </w:p>
-          <w:p>
-            <w:r>
-              <w:rPr>
-                <w:i/>
-                <w:color w:val="555555"/>
-                <w:sz w:val="14"/>
-              </w:rPr>
-              <w:t>What was read: Section 21 read on India Code 2026-10-16.</w:t>
+              <w:t>(no appeal-route line drafted for this Act)</w:t>
             </w:r>
           </w:p>
         </w:tc>
@@ -4120,9 +4104,9 @@
                 <w:b w:val="0"/>
                 <w:sz w:val="16"/>
               </w:rPr>
-              <w:t>The Sexual Harassment of Women at Workplace (Prevention, Prohibition and Redressal) Act, 2013</w:t>
+              <w:t>The National Investigation Agency Act, 2008</w:t>
               <w:br/>
-              <w:t>Act 14 of 2013</w:t>
+              <w:t>Act 34 of 2008</w:t>
             </w:r>
           </w:p>
           <w:p>
@@ -4132,7 +4116,7 @@
                 <w:color w:val="555555"/>
                 <w:sz w:val="14"/>
               </w:rPr>
-              <w:t>India Code's own record: "The Sexual Harassment of Women at Workplace (Prevention, Prohibition and Redressal) Act, 2013"; not marked repealed; enforcement date 09-12-2013.</w:t>
+              <w:t>India Code's own record: "The National Investigation Agency Act, 2008"; not marked repealed; enforcement date 31-12-2008.</w:t>
             </w:r>
           </w:p>
         </w:tc>
@@ -4147,7 +4131,7 @@
                 <w:b w:val="0"/>
                 <w:sz w:val="16"/>
               </w:rPr>
-              <w:t>In force since 9 December 2013.</w:t>
+              <w:t>In force. Amended in 2019 (India Code's footnote to section 22 cites Act 16 of 2019, from 2 August 2019).</w:t>
             </w:r>
           </w:p>
           <w:p>
@@ -4157,7 +4141,7 @@
                 <w:color w:val="555555"/>
                 <w:sz w:val="14"/>
               </w:rPr>
-              <w:t>What was read: India Code, read 2026-10-16: enforcement date 09-12-2013; not marked repealed.</w:t>
+              <w:t>What was read: India Code, read 2026-10-16: not marked repealed; its amendment list names the National Investigation Agency (Amendment) Act, 2019; the footnote to section 22 cites Act 16 of 2019 w.e.f. 2-8-2019.</w:t>
             </w:r>
           </w:p>
         </w:tc>
@@ -4187,7 +4171,23 @@
                 <w:b w:val="0"/>
                 <w:sz w:val="16"/>
               </w:rPr>
-              <w:t>(no appeal-route line drafted for this Act)</w:t>
+              <w:t>An appeal lies from any judgment, sentence or order (other than an interlocutory order) of a Special Court to the High Court, on facts and on law, heard by a bench of two Judges, within 30 days (the High Court may allow up to 90). An order granting or refusing bail is also appealable to the High Court (section 21).</w:t>
+            </w:r>
+            <w:r>
+              <w:rPr>
+                <w:sz w:val="16"/>
+              </w:rPr>
+              <w:t xml:space="preserve"> [certain]</w:t>
+            </w:r>
+          </w:p>
+          <w:p>
+            <w:r>
+              <w:rPr>
+                <w:i/>
+                <w:color w:val="555555"/>
+                <w:sz w:val="14"/>
+              </w:rPr>
+              <w:t>What was read: Section 21 read on India Code 2026-10-16.</w:t>
             </w:r>
           </w:p>
         </w:tc>
@@ -4272,9 +4272,9 @@
                 <w:b w:val="0"/>
                 <w:sz w:val="16"/>
               </w:rPr>
-              <w:t>The Terrorist and Disruptive Activities (Prevention) Act, 1987</w:t>
+              <w:t>The Prevention of Damage to Public Property Act, 1984</w:t>
               <w:br/>
-              <w:t>Act 28 of 1987</w:t>
+              <w:t>Act 3 of 1984</w:t>
             </w:r>
           </w:p>
           <w:p>
@@ -4284,7 +4284,7 @@
                 <w:color w:val="555555"/>
                 <w:sz w:val="14"/>
               </w:rPr>
-              <w:t>India Code's own record: "The Terrorist and Disruptive Activities (Prevention) Act, 1987, 28 of 1987 (Rep., Act 30 of 2001)"; repealed by Act 30 of 2001.</w:t>
+              <w:t>India Code's own record: "The Prevention of Damage to Public Property Act, 1984"; not marked repealed; enforcement date 28-01-1984.</w:t>
             </w:r>
           </w:p>
         </w:tc>
@@ -4299,7 +4299,7 @@
                 <w:b w:val="0"/>
                 <w:sz w:val="16"/>
               </w:rPr>
-              <w:t>No longer in force: India Code lists it as repealed by Act 30 of 2001, and it had ceased to operate earlier, in May 1995. As enacted it was to remain in force for two years from 24 May 1987 (section 1(4)); later amendments extended that. Section 1(4) saved things done, rights acquired and proceedings begun before it ended.</w:t>
+              <w:t>In force since 28 January 1984. The words "except the State of Jammu and Kashmir" were omitted from section 1 from 31 October 2019.</w:t>
             </w:r>
           </w:p>
           <w:p>
@@ -4309,7 +4309,7 @@
                 <w:color w:val="555555"/>
                 <w:sz w:val="14"/>
               </w:rPr>
-              <w:t>What was read: India Code's archive entry reads '(Rep., Act 30 of 2001)'. Section 1(4) read in India Code's PDF of the Act as enacted (two years from the 24th day of May, 1987; savings for rights, penalties and legal proceedings). India Code lists the Amendment Acts of 1985, 1989, 1991 and 1993. The May 1995 date and the length of the extensions are Claude's recollection, not read.</w:t>
+              <w:t>What was read: India Code, read 2026-10-17: section 1(3) says the Act is deemed to have come into force on 28 January 1984, and India Code gives the enforcement date 28-01-1984; not marked repealed; footnote to section 1: the words "except the State of Jammu and Kashmir" omitted by Act 34 of 2019, s. 95 and the Fifth Schedule (w.e.f. 31-10-2019). The Act has no appeal section of its own (sections 1 to 7 read), so no appeal line is drafted.</w:t>
             </w:r>
           </w:p>
         </w:tc>
@@ -4324,7 +4324,7 @@
                 <w:b w:val="0"/>
                 <w:sz w:val="16"/>
               </w:rPr>
-              <w:t>likely</w:t>
+              <w:t>certain</w:t>
             </w:r>
           </w:p>
         </w:tc>
@@ -4339,23 +4339,7 @@
                 <w:b w:val="0"/>
                 <w:sz w:val="16"/>
               </w:rPr>
-              <w:t>As enacted, section 19 gave an appeal as of right from any judgment, sentence or order (other than an interlocutory order) of a Designated Court directly to the Supreme Court, on facts and on law, within 30 days; no other appeal or revision lay.</w:t>
-            </w:r>
-            <w:r>
-              <w:rPr>
-                <w:sz w:val="16"/>
-              </w:rPr>
-              <w:t xml:space="preserve"> [likely]</w:t>
-            </w:r>
-          </w:p>
-          <w:p>
-            <w:r>
-              <w:rPr>
-                <w:i/>
-                <w:color w:val="555555"/>
-                <w:sz w:val="14"/>
-              </w:rPr>
-              <w:t>What was read: Section 19 read in India Code's PDF of the Act as enacted (2026-10-16). Later amendments to section 19, if any, were not checked.</w:t>
+              <w:t>(no appeal-route line drafted for this Act)</w:t>
             </w:r>
           </w:p>
         </w:tc>
@@ -4440,9 +4424,9 @@
                 <w:b w:val="0"/>
                 <w:sz w:val="16"/>
               </w:rPr>
-              <w:t>The Transfer of Property Act, 1882</w:t>
+              <w:t>The Prohibition of Child Marriage Act, 2006</w:t>
               <w:br/>
-              <w:t>Act 4 of 1882</w:t>
+              <w:t>Act 6 of 2007</w:t>
             </w:r>
           </w:p>
           <w:p>
@@ -4452,7 +4436,7 @@
                 <w:color w:val="555555"/>
                 <w:sz w:val="14"/>
               </w:rPr>
-              <w:t>India Code's own record: "The Transfer of Property Act, 1882"; not marked repealed; enforcement date 1882-07-01.</w:t>
+              <w:t>India Code's own record: "The Prohibition of Child Marriage Act, 2006"; not marked repealed; enforcement date 01-11-2007.</w:t>
             </w:r>
           </w:p>
         </w:tc>
@@ -4467,7 +4451,7 @@
                 <w:b w:val="0"/>
                 <w:sz w:val="16"/>
               </w:rPr>
-              <w:t>In force since 1 July 1882.</w:t>
+              <w:t>In force since 1 November 2007. The words "except the State of Jammu and Kashmir" were omitted from section 1 from 31 October 2019.</w:t>
             </w:r>
           </w:p>
           <w:p>
@@ -4477,7 +4461,7 @@
                 <w:color w:val="555555"/>
                 <w:sz w:val="14"/>
               </w:rPr>
-              <w:t>What was read: India Code, read 2026-10-16: enforcement date 1882-07-01; not marked repealed.</w:t>
+              <w:t>What was read: India Code, read 2026-10-17: enforcement date 01-11-2007 (footnote to section 1: notification S.O. 1850(E) of 30 October 2007); not marked repealed; footnote to section 1: the words "except the State of Jammu and Kashmir" omitted by Act 34 of 2019, s. 95 and the Fifth Schedule (w.e.f. 31-10-2019). The Act has no appeal section of its own (sections 1 to 21 read), so no appeal line is drafted.</w:t>
             </w:r>
           </w:p>
         </w:tc>
@@ -4592,11 +4576,9 @@
                 <w:b w:val="0"/>
                 <w:sz w:val="16"/>
               </w:rPr>
-              <w:t>The Code of Criminal Procedure, 1973</w:t>
+              <w:t>The Protection of Civil Rights Act, 1955</w:t>
               <w:br/>
-              <w:t>Act 2 of 1974</w:t>
-              <w:br/>
-              <w:t>(not detected by the site: the concordance already maps it)</w:t>
+              <w:t>Act 22 of 1955</w:t>
             </w:r>
           </w:p>
           <w:p>
@@ -4606,7 +4588,7 @@
                 <w:color w:val="555555"/>
                 <w:sz w:val="14"/>
               </w:rPr>
-              <w:t>India Code's own record: "The Code of Criminal Procedure 1973, 02 of 1974 (Rep., Act 46 of 2023)"; repealed by Act 46 of 2023.</w:t>
+              <w:t>India Code's own record: "The Protection of Civil Rights Act, 1955"; not marked repealed; enforcement date 01-06-1955.</w:t>
             </w:r>
           </w:p>
         </w:tc>
@@ -4621,7 +4603,7 @@
                 <w:b w:val="0"/>
                 <w:sz w:val="16"/>
               </w:rPr>
-              <w:t>Repealed by the Bharatiya Nagarik Suraksha Sanhita, 2023 (Act 46 of 2023), in force from 1 July 2024. An appeal, application, trial, inquiry or investigation pending on that date continues under the old Code (BNSS section 531(2)(a)).</w:t>
+              <w:t>In force since 1 June 1955. It was first called the Untouchability (Offences) Act and took its present name by amendments in force from 19 November 1976 (Act 106 of 1976).</w:t>
             </w:r>
           </w:p>
           <w:p>
@@ -4631,7 +4613,7 @@
                 <w:color w:val="555555"/>
                 <w:sz w:val="14"/>
               </w:rPr>
-              <w:t>What was read: India Code's archive entry reads '(Rep., Act 46 of 2023)'; India Code gives 01-07-2024 as the BNSS enforcement date; BNSS section 531 read in the library text (2026-10-16).</w:t>
+              <w:t>What was read: India Code, read 2026-10-17: enforcement date 01-06-1955 (footnote to section 1: notification S.R.O. 1109(E) of 23 May 1955); not marked repealed; footnote to section 1: "the Protection of Civil Rights Act" substituted for "the Untouchability (Offences) Act" (w.e.f. 19-11-1976); footnotes to sections 3 to 17 and others cite Act 106 of 1976 (w.e.f. 19-11-1976). The Act has no appeal section of its own (sections 1 to 17 read, section 9 mentions only a conviction "not reversed or quashed in any appeal or revision"), so no appeal line is drafted.</w:t>
             </w:r>
           </w:p>
         </w:tc>
@@ -4687,6 +4669,632 @@
                 <w:t>open on India Code</w:t>
               </w:r>
             </w:hyperlink>
+          </w:p>
+        </w:tc>
+        <w:tc>
+          <w:tcPr>
+            <w:tcW w:type="dxa" w:w="1644"/>
+          </w:tcPr>
+          <w:p>
+            <w:r/>
+            <w:r>
+              <w:rPr>
+                <w:b w:val="0"/>
+                <w:sz w:val="16"/>
+              </w:rPr>
+              <w:t>S: ____   A: ____   L: ____</w:t>
+            </w:r>
+          </w:p>
+        </w:tc>
+        <w:tc>
+          <w:tcPr>
+            <w:tcW w:type="dxa" w:w="1474"/>
+          </w:tcPr>
+          <w:p>
+            <w:r/>
+            <w:r>
+              <w:rPr>
+                <w:b w:val="0"/>
+                <w:sz w:val="16"/>
+              </w:rPr>
+            </w:r>
+          </w:p>
+        </w:tc>
+      </w:tr>
+      <w:tr>
+        <w:tc>
+          <w:tcPr>
+            <w:tcW w:type="dxa" w:w="510"/>
+          </w:tcPr>
+          <w:p>
+            <w:r/>
+            <w:r>
+              <w:rPr>
+                <w:b w:val="0"/>
+                <w:sz w:val="16"/>
+              </w:rPr>
+              <w:t>30</w:t>
+            </w:r>
+          </w:p>
+        </w:tc>
+        <w:tc>
+          <w:tcPr>
+            <w:tcW w:type="dxa" w:w="2608"/>
+          </w:tcPr>
+          <w:p>
+            <w:r/>
+            <w:r>
+              <w:rPr>
+                <w:b w:val="0"/>
+                <w:sz w:val="16"/>
+              </w:rPr>
+              <w:t>The Sexual Harassment of Women at Workplace (Prevention, Prohibition and Redressal) Act, 2013</w:t>
+              <w:br/>
+              <w:t>Act 14 of 2013</w:t>
+            </w:r>
+          </w:p>
+          <w:p>
+            <w:r>
+              <w:rPr>
+                <w:i/>
+                <w:color w:val="555555"/>
+                <w:sz w:val="14"/>
+              </w:rPr>
+              <w:t>India Code's own record: "The Sexual Harassment of Women at Workplace (Prevention, Prohibition and Redressal) Act, 2013"; not marked repealed; enforcement date 09-12-2013.</w:t>
+            </w:r>
+          </w:p>
+        </w:tc>
+        <w:tc>
+          <w:tcPr>
+            <w:tcW w:type="dxa" w:w="3175"/>
+          </w:tcPr>
+          <w:p>
+            <w:r/>
+            <w:r>
+              <w:rPr>
+                <w:b w:val="0"/>
+                <w:sz w:val="16"/>
+              </w:rPr>
+              <w:t>In force since 9 December 2013.</w:t>
+            </w:r>
+          </w:p>
+          <w:p>
+            <w:r>
+              <w:rPr>
+                <w:i/>
+                <w:color w:val="555555"/>
+                <w:sz w:val="14"/>
+              </w:rPr>
+              <w:t>What was read: India Code, read 2026-10-16: enforcement date 09-12-2013; not marked repealed.</w:t>
+            </w:r>
+          </w:p>
+        </w:tc>
+        <w:tc>
+          <w:tcPr>
+            <w:tcW w:type="dxa" w:w="794"/>
+          </w:tcPr>
+          <w:p>
+            <w:r/>
+            <w:r>
+              <w:rPr>
+                <w:b w:val="0"/>
+                <w:sz w:val="16"/>
+              </w:rPr>
+              <w:t>certain</w:t>
+            </w:r>
+          </w:p>
+        </w:tc>
+        <w:tc>
+          <w:tcPr>
+            <w:tcW w:type="dxa" w:w="3175"/>
+          </w:tcPr>
+          <w:p>
+            <w:r/>
+            <w:r>
+              <w:rPr>
+                <w:b w:val="0"/>
+                <w:sz w:val="16"/>
+              </w:rPr>
+              <w:t>(no appeal-route line drafted for this Act)</w:t>
+            </w:r>
+          </w:p>
+        </w:tc>
+        <w:tc>
+          <w:tcPr>
+            <w:tcW w:type="dxa" w:w="1474"/>
+          </w:tcPr>
+          <w:p>
+            <w:r/>
+            <w:r>
+              <w:rPr>
+                <w:b w:val="0"/>
+                <w:sz w:val="16"/>
+              </w:rPr>
+            </w:r>
+            <w:hyperlink r:id="rId38">
+              <w:r>
+                <w:rPr>
+                  <w:color w:val="0563C1"/>
+                  <w:sz w:val="14"/>
+                  <w:u w:val="single"/>
+                </w:rPr>
+                <w:t>open on India Code</w:t>
+              </w:r>
+            </w:hyperlink>
+          </w:p>
+        </w:tc>
+        <w:tc>
+          <w:tcPr>
+            <w:tcW w:type="dxa" w:w="1644"/>
+          </w:tcPr>
+          <w:p>
+            <w:r/>
+            <w:r>
+              <w:rPr>
+                <w:b w:val="0"/>
+                <w:sz w:val="16"/>
+              </w:rPr>
+              <w:t>S: ____   A: ____   L: ____</w:t>
+            </w:r>
+          </w:p>
+        </w:tc>
+        <w:tc>
+          <w:tcPr>
+            <w:tcW w:type="dxa" w:w="1474"/>
+          </w:tcPr>
+          <w:p>
+            <w:r/>
+            <w:r>
+              <w:rPr>
+                <w:b w:val="0"/>
+                <w:sz w:val="16"/>
+              </w:rPr>
+            </w:r>
+          </w:p>
+        </w:tc>
+      </w:tr>
+      <w:tr>
+        <w:tc>
+          <w:tcPr>
+            <w:tcW w:type="dxa" w:w="510"/>
+          </w:tcPr>
+          <w:p>
+            <w:r/>
+            <w:r>
+              <w:rPr>
+                <w:b w:val="0"/>
+                <w:sz w:val="16"/>
+              </w:rPr>
+              <w:t>31</w:t>
+            </w:r>
+          </w:p>
+        </w:tc>
+        <w:tc>
+          <w:tcPr>
+            <w:tcW w:type="dxa" w:w="2608"/>
+          </w:tcPr>
+          <w:p>
+            <w:r/>
+            <w:r>
+              <w:rPr>
+                <w:b w:val="0"/>
+                <w:sz w:val="16"/>
+              </w:rPr>
+              <w:t>The Terrorist and Disruptive Activities (Prevention) Act, 1987</w:t>
+              <w:br/>
+              <w:t>Act 28 of 1987</w:t>
+            </w:r>
+          </w:p>
+          <w:p>
+            <w:r>
+              <w:rPr>
+                <w:i/>
+                <w:color w:val="555555"/>
+                <w:sz w:val="14"/>
+              </w:rPr>
+              <w:t>India Code's own record: "The Terrorist and Disruptive Activities (Prevention) Act, 1987, 28 of 1987 (Rep., Act 30 of 2001)"; repealed by Act 30 of 2001.</w:t>
+            </w:r>
+          </w:p>
+        </w:tc>
+        <w:tc>
+          <w:tcPr>
+            <w:tcW w:type="dxa" w:w="3175"/>
+          </w:tcPr>
+          <w:p>
+            <w:r/>
+            <w:r>
+              <w:rPr>
+                <w:b w:val="0"/>
+                <w:sz w:val="16"/>
+              </w:rPr>
+              <w:t>No longer in force: India Code lists it as repealed by Act 30 of 2001, and it had ceased to operate earlier, in May 1995. As enacted it was to remain in force for two years from 24 May 1987 (section 1(4)); later amendments extended that. Section 1(4) saved things done, rights acquired and proceedings begun before it ended.</w:t>
+            </w:r>
+          </w:p>
+          <w:p>
+            <w:r>
+              <w:rPr>
+                <w:i/>
+                <w:color w:val="555555"/>
+                <w:sz w:val="14"/>
+              </w:rPr>
+              <w:t>What was read: India Code's archive entry reads '(Rep., Act 30 of 2001)'. Section 1(4) read in India Code's PDF of the Act as enacted (two years from the 24th day of May, 1987; savings for rights, penalties and legal proceedings). India Code lists the Amendment Acts of 1985, 1989, 1991 and 1993. The May 1995 date and the length of the extensions are Claude's recollection, not read.</w:t>
+            </w:r>
+          </w:p>
+        </w:tc>
+        <w:tc>
+          <w:tcPr>
+            <w:tcW w:type="dxa" w:w="794"/>
+          </w:tcPr>
+          <w:p>
+            <w:r/>
+            <w:r>
+              <w:rPr>
+                <w:b w:val="0"/>
+                <w:sz w:val="16"/>
+              </w:rPr>
+              <w:t>likely</w:t>
+            </w:r>
+          </w:p>
+        </w:tc>
+        <w:tc>
+          <w:tcPr>
+            <w:tcW w:type="dxa" w:w="3175"/>
+          </w:tcPr>
+          <w:p>
+            <w:r/>
+            <w:r>
+              <w:rPr>
+                <w:b w:val="0"/>
+                <w:sz w:val="16"/>
+              </w:rPr>
+              <w:t>As enacted, section 19 gave an appeal as of right from any judgment, sentence or order (other than an interlocutory order) of a Designated Court directly to the Supreme Court, on facts and on law, within 30 days; no other appeal or revision lay.</w:t>
+            </w:r>
+            <w:r>
+              <w:rPr>
+                <w:sz w:val="16"/>
+              </w:rPr>
+              <w:t xml:space="preserve"> [likely]</w:t>
+            </w:r>
+          </w:p>
+          <w:p>
+            <w:r>
+              <w:rPr>
+                <w:i/>
+                <w:color w:val="555555"/>
+                <w:sz w:val="14"/>
+              </w:rPr>
+              <w:t>What was read: Section 19 read in India Code's PDF of the Act as enacted (2026-10-16). Later amendments to section 19, if any, were not checked.</w:t>
+            </w:r>
+          </w:p>
+        </w:tc>
+        <w:tc>
+          <w:tcPr>
+            <w:tcW w:type="dxa" w:w="1474"/>
+          </w:tcPr>
+          <w:p>
+            <w:r/>
+            <w:r>
+              <w:rPr>
+                <w:b w:val="0"/>
+                <w:sz w:val="16"/>
+              </w:rPr>
+            </w:r>
+            <w:hyperlink r:id="rId39">
+              <w:r>
+                <w:rPr>
+                  <w:color w:val="0563C1"/>
+                  <w:sz w:val="14"/>
+                  <w:u w:val="single"/>
+                </w:rPr>
+                <w:t>open on India Code</w:t>
+              </w:r>
+            </w:hyperlink>
+          </w:p>
+        </w:tc>
+        <w:tc>
+          <w:tcPr>
+            <w:tcW w:type="dxa" w:w="1644"/>
+          </w:tcPr>
+          <w:p>
+            <w:r/>
+            <w:r>
+              <w:rPr>
+                <w:b w:val="0"/>
+                <w:sz w:val="16"/>
+              </w:rPr>
+              <w:t>S: ____   A: ____   L: ____</w:t>
+            </w:r>
+          </w:p>
+        </w:tc>
+        <w:tc>
+          <w:tcPr>
+            <w:tcW w:type="dxa" w:w="1474"/>
+          </w:tcPr>
+          <w:p>
+            <w:r/>
+            <w:r>
+              <w:rPr>
+                <w:b w:val="0"/>
+                <w:sz w:val="16"/>
+              </w:rPr>
+            </w:r>
+          </w:p>
+        </w:tc>
+      </w:tr>
+      <w:tr>
+        <w:tc>
+          <w:tcPr>
+            <w:tcW w:type="dxa" w:w="510"/>
+          </w:tcPr>
+          <w:p>
+            <w:r/>
+            <w:r>
+              <w:rPr>
+                <w:b w:val="0"/>
+                <w:sz w:val="16"/>
+              </w:rPr>
+              <w:t>32</w:t>
+            </w:r>
+          </w:p>
+        </w:tc>
+        <w:tc>
+          <w:tcPr>
+            <w:tcW w:type="dxa" w:w="2608"/>
+          </w:tcPr>
+          <w:p>
+            <w:r/>
+            <w:r>
+              <w:rPr>
+                <w:b w:val="0"/>
+                <w:sz w:val="16"/>
+              </w:rPr>
+              <w:t>The Transfer of Property Act, 1882</w:t>
+              <w:br/>
+              <w:t>Act 4 of 1882</w:t>
+            </w:r>
+          </w:p>
+          <w:p>
+            <w:r>
+              <w:rPr>
+                <w:i/>
+                <w:color w:val="555555"/>
+                <w:sz w:val="14"/>
+              </w:rPr>
+              <w:t>India Code's own record: "The Transfer of Property Act, 1882"; not marked repealed; enforcement date 1882-07-01.</w:t>
+            </w:r>
+          </w:p>
+        </w:tc>
+        <w:tc>
+          <w:tcPr>
+            <w:tcW w:type="dxa" w:w="3175"/>
+          </w:tcPr>
+          <w:p>
+            <w:r/>
+            <w:r>
+              <w:rPr>
+                <w:b w:val="0"/>
+                <w:sz w:val="16"/>
+              </w:rPr>
+              <w:t>In force since 1 July 1882.</w:t>
+            </w:r>
+          </w:p>
+          <w:p>
+            <w:r>
+              <w:rPr>
+                <w:i/>
+                <w:color w:val="555555"/>
+                <w:sz w:val="14"/>
+              </w:rPr>
+              <w:t>What was read: India Code, read 2026-10-16: enforcement date 1882-07-01; not marked repealed.</w:t>
+            </w:r>
+          </w:p>
+        </w:tc>
+        <w:tc>
+          <w:tcPr>
+            <w:tcW w:type="dxa" w:w="794"/>
+          </w:tcPr>
+          <w:p>
+            <w:r/>
+            <w:r>
+              <w:rPr>
+                <w:b w:val="0"/>
+                <w:sz w:val="16"/>
+              </w:rPr>
+              <w:t>certain</w:t>
+            </w:r>
+          </w:p>
+        </w:tc>
+        <w:tc>
+          <w:tcPr>
+            <w:tcW w:type="dxa" w:w="3175"/>
+          </w:tcPr>
+          <w:p>
+            <w:r/>
+            <w:r>
+              <w:rPr>
+                <w:b w:val="0"/>
+                <w:sz w:val="16"/>
+              </w:rPr>
+              <w:t>(no appeal-route line drafted for this Act)</w:t>
+            </w:r>
+          </w:p>
+        </w:tc>
+        <w:tc>
+          <w:tcPr>
+            <w:tcW w:type="dxa" w:w="1474"/>
+          </w:tcPr>
+          <w:p>
+            <w:r/>
+            <w:r>
+              <w:rPr>
+                <w:b w:val="0"/>
+                <w:sz w:val="16"/>
+              </w:rPr>
+            </w:r>
+            <w:hyperlink r:id="rId40">
+              <w:r>
+                <w:rPr>
+                  <w:color w:val="0563C1"/>
+                  <w:sz w:val="14"/>
+                  <w:u w:val="single"/>
+                </w:rPr>
+                <w:t>open on India Code</w:t>
+              </w:r>
+            </w:hyperlink>
+          </w:p>
+        </w:tc>
+        <w:tc>
+          <w:tcPr>
+            <w:tcW w:type="dxa" w:w="1644"/>
+          </w:tcPr>
+          <w:p>
+            <w:r/>
+            <w:r>
+              <w:rPr>
+                <w:b w:val="0"/>
+                <w:sz w:val="16"/>
+              </w:rPr>
+              <w:t>S: ____   A: ____   L: ____</w:t>
+            </w:r>
+          </w:p>
+        </w:tc>
+        <w:tc>
+          <w:tcPr>
+            <w:tcW w:type="dxa" w:w="1474"/>
+          </w:tcPr>
+          <w:p>
+            <w:r/>
+            <w:r>
+              <w:rPr>
+                <w:b w:val="0"/>
+                <w:sz w:val="16"/>
+              </w:rPr>
+            </w:r>
+          </w:p>
+        </w:tc>
+      </w:tr>
+      <w:tr>
+        <w:tc>
+          <w:tcPr>
+            <w:tcW w:type="dxa" w:w="510"/>
+          </w:tcPr>
+          <w:p>
+            <w:r/>
+            <w:r>
+              <w:rPr>
+                <w:b w:val="0"/>
+                <w:sz w:val="16"/>
+              </w:rPr>
+              <w:t>33</w:t>
+            </w:r>
+          </w:p>
+        </w:tc>
+        <w:tc>
+          <w:tcPr>
+            <w:tcW w:type="dxa" w:w="2608"/>
+          </w:tcPr>
+          <w:p>
+            <w:r/>
+            <w:r>
+              <w:rPr>
+                <w:b w:val="0"/>
+                <w:sz w:val="16"/>
+              </w:rPr>
+              <w:t>The Code of Criminal Procedure, 1973</w:t>
+              <w:br/>
+              <w:t>Act 2 of 1974</w:t>
+              <w:br/>
+              <w:t>(not detected by the site: the concordance already maps it)</w:t>
+            </w:r>
+          </w:p>
+          <w:p>
+            <w:r>
+              <w:rPr>
+                <w:i/>
+                <w:color w:val="555555"/>
+                <w:sz w:val="14"/>
+              </w:rPr>
+              <w:t>India Code's own record: "The Code of Criminal Procedure 1973, 02 of 1974 (Rep., Act 46 of 2023)"; repealed by Act 46 of 2023.</w:t>
+            </w:r>
+          </w:p>
+        </w:tc>
+        <w:tc>
+          <w:tcPr>
+            <w:tcW w:type="dxa" w:w="3175"/>
+          </w:tcPr>
+          <w:p>
+            <w:r/>
+            <w:r>
+              <w:rPr>
+                <w:b w:val="0"/>
+                <w:sz w:val="16"/>
+              </w:rPr>
+              <w:t>Repealed by the Bharatiya Nagarik Suraksha Sanhita, 2023 (Act 46 of 2023), in force from 1 July 2024. An appeal, application, trial, inquiry or investigation pending on that date continues under the old Code (BNSS section 531(2)(a)).</w:t>
+            </w:r>
+          </w:p>
+          <w:p>
+            <w:r>
+              <w:rPr>
+                <w:i/>
+                <w:color w:val="555555"/>
+                <w:sz w:val="14"/>
+              </w:rPr>
+              <w:t>What was read: India Code's archive entry reads '(Rep., Act 46 of 2023)'; India Code gives 01-07-2024 as the BNSS enforcement date; BNSS section 531 read in the library text (2026-10-16).</w:t>
+            </w:r>
+          </w:p>
+        </w:tc>
+        <w:tc>
+          <w:tcPr>
+            <w:tcW w:type="dxa" w:w="794"/>
+          </w:tcPr>
+          <w:p>
+            <w:r/>
+            <w:r>
+              <w:rPr>
+                <w:b w:val="0"/>
+                <w:sz w:val="16"/>
+              </w:rPr>
+              <w:t>certain</w:t>
+            </w:r>
+          </w:p>
+        </w:tc>
+        <w:tc>
+          <w:tcPr>
+            <w:tcW w:type="dxa" w:w="3175"/>
+          </w:tcPr>
+          <w:p>
+            <w:r/>
+            <w:r>
+              <w:rPr>
+                <w:b w:val="0"/>
+                <w:sz w:val="16"/>
+              </w:rPr>
+              <w:t>(no appeal-route line drafted for this Act)</w:t>
+            </w:r>
+          </w:p>
+        </w:tc>
+        <w:tc>
+          <w:tcPr>
+            <w:tcW w:type="dxa" w:w="1474"/>
+          </w:tcPr>
+          <w:p>
+            <w:r/>
+            <w:r>
+              <w:rPr>
+                <w:b w:val="0"/>
+                <w:sz w:val="16"/>
+              </w:rPr>
+            </w:r>
+            <w:hyperlink r:id="rId41">
+              <w:r>
+                <w:rPr>
+                  <w:color w:val="0563C1"/>
+                  <w:sz w:val="14"/>
+                  <w:u w:val="single"/>
+                </w:rPr>
+                <w:t>open on India Code</w:t>
+              </w:r>
+            </w:hyperlink>
             <w:r>
               <w:rPr>
                 <w:sz w:val="14"/>
@@ -4738,7 +5346,7 @@
                 <w:b w:val="0"/>
                 <w:sz w:val="16"/>
               </w:rPr>
-              <w:t>30</w:t>
+              <w:t>34</w:t>
             </w:r>
           </w:p>
         </w:tc>
@@ -4838,7 +5446,7 @@
                 <w:sz w:val="16"/>
               </w:rPr>
             </w:r>
-            <w:hyperlink r:id="rId38">
+            <w:hyperlink r:id="rId42">
               <w:r>
                 <w:rPr>
                   <w:color w:val="0563C1"/>
@@ -6099,6 +6707,53 @@
                 <w:b w:val="0"/>
                 <w:sz w:val="16"/>
               </w:rPr>
+              <w:t>Muslim Women (Protection of Rights on Marriage) Act, 2019</w:t>
+            </w:r>
+          </w:p>
+        </w:tc>
+        <w:tc>
+          <w:tcPr>
+            <w:tcW w:type="dxa" w:w="4751"/>
+          </w:tcPr>
+          <w:p>
+            <w:r/>
+            <w:r>
+              <w:rPr>
+                <w:b w:val="0"/>
+                <w:sz w:val="16"/>
+              </w:rPr>
+              <w:t>muslim women protection of rights on marriage act; muslim women act 2019; triple talaq act; triple talaq law</w:t>
+            </w:r>
+          </w:p>
+        </w:tc>
+        <w:tc>
+          <w:tcPr>
+            <w:tcW w:type="dxa" w:w="4751"/>
+          </w:tcPr>
+          <w:p>
+            <w:r/>
+            <w:r>
+              <w:rPr>
+                <w:b w:val="0"/>
+                <w:sz w:val="16"/>
+              </w:rPr>
+              <w:t>triple talaq; instant talaq; talaq e biddat; pronounced talaq three times; talaq three times</w:t>
+            </w:r>
+          </w:p>
+        </w:tc>
+      </w:tr>
+      <w:tr>
+        <w:tc>
+          <w:tcPr>
+            <w:tcW w:type="dxa" w:w="4751"/>
+          </w:tcPr>
+          <w:p>
+            <w:r/>
+            <w:r>
+              <w:rPr>
+                <w:b w:val="0"/>
+                <w:sz w:val="16"/>
+              </w:rPr>
               <w:t>National Investigation Agency Act, 2008</w:t>
             </w:r>
           </w:p>
@@ -6130,6 +6785,147 @@
                 <w:sz w:val="16"/>
               </w:rPr>
               <w:t>(none)</w:t>
+            </w:r>
+          </w:p>
+        </w:tc>
+      </w:tr>
+      <w:tr>
+        <w:tc>
+          <w:tcPr>
+            <w:tcW w:type="dxa" w:w="4751"/>
+          </w:tcPr>
+          <w:p>
+            <w:r/>
+            <w:r>
+              <w:rPr>
+                <w:b w:val="0"/>
+                <w:sz w:val="16"/>
+              </w:rPr>
+              <w:t>Prevention of Damage to Public Property Act, 1984</w:t>
+            </w:r>
+          </w:p>
+        </w:tc>
+        <w:tc>
+          <w:tcPr>
+            <w:tcW w:type="dxa" w:w="4751"/>
+          </w:tcPr>
+          <w:p>
+            <w:r/>
+            <w:r>
+              <w:rPr>
+                <w:b w:val="0"/>
+                <w:sz w:val="16"/>
+              </w:rPr>
+              <w:t>prevention of damage to public property act; damage to public property act; pdpp act; pdpp</w:t>
+            </w:r>
+          </w:p>
+        </w:tc>
+        <w:tc>
+          <w:tcPr>
+            <w:tcW w:type="dxa" w:w="4751"/>
+          </w:tcPr>
+          <w:p>
+            <w:r/>
+            <w:r>
+              <w:rPr>
+                <w:b w:val="0"/>
+                <w:sz w:val="16"/>
+              </w:rPr>
+              <w:t>damage to public property; damaging public property; damaged public property; destruction of public property; destroying public property; destroyed public property; public property damage</w:t>
+            </w:r>
+          </w:p>
+        </w:tc>
+      </w:tr>
+      <w:tr>
+        <w:tc>
+          <w:tcPr>
+            <w:tcW w:type="dxa" w:w="4751"/>
+          </w:tcPr>
+          <w:p>
+            <w:r/>
+            <w:r>
+              <w:rPr>
+                <w:b w:val="0"/>
+                <w:sz w:val="16"/>
+              </w:rPr>
+              <w:t>Prohibition of Child Marriage Act, 2006</w:t>
+            </w:r>
+          </w:p>
+        </w:tc>
+        <w:tc>
+          <w:tcPr>
+            <w:tcW w:type="dxa" w:w="4751"/>
+          </w:tcPr>
+          <w:p>
+            <w:r/>
+            <w:r>
+              <w:rPr>
+                <w:b w:val="0"/>
+                <w:sz w:val="16"/>
+              </w:rPr>
+              <w:t>prohibition of child marriage act; child marriage act; pcma; child marriage prohibition act</w:t>
+            </w:r>
+          </w:p>
+        </w:tc>
+        <w:tc>
+          <w:tcPr>
+            <w:tcW w:type="dxa" w:w="4751"/>
+          </w:tcPr>
+          <w:p>
+            <w:r/>
+            <w:r>
+              <w:rPr>
+                <w:b w:val="0"/>
+                <w:sz w:val="16"/>
+              </w:rPr>
+              <w:t>child marriage; child marriages; underage marriage; underage marriages; underage wedding; child marriage prohibition officer; married below the legal age; marriage below the legal age</w:t>
+            </w:r>
+          </w:p>
+        </w:tc>
+      </w:tr>
+      <w:tr>
+        <w:tc>
+          <w:tcPr>
+            <w:tcW w:type="dxa" w:w="4751"/>
+          </w:tcPr>
+          <w:p>
+            <w:r/>
+            <w:r>
+              <w:rPr>
+                <w:b w:val="0"/>
+                <w:sz w:val="16"/>
+              </w:rPr>
+              <w:t>Protection of Civil Rights Act, 1955</w:t>
+            </w:r>
+          </w:p>
+        </w:tc>
+        <w:tc>
+          <w:tcPr>
+            <w:tcW w:type="dxa" w:w="4751"/>
+          </w:tcPr>
+          <w:p>
+            <w:r/>
+            <w:r>
+              <w:rPr>
+                <w:b w:val="0"/>
+                <w:sz w:val="16"/>
+              </w:rPr>
+              <w:t>protection of civil rights act; pcr act; untouchability offences act; civil rights act 1955</w:t>
+            </w:r>
+          </w:p>
+        </w:tc>
+        <w:tc>
+          <w:tcPr>
+            <w:tcW w:type="dxa" w:w="4751"/>
+          </w:tcPr>
+          <w:p>
+            <w:r/>
+            <w:r>
+              <w:rPr>
+                <w:b w:val="0"/>
+                <w:sz w:val="16"/>
+              </w:rPr>
+              <w:t>practice of untouchability; practising untouchability; practicing untouchability; enforcing untouchability; untouchability offence; untouchability offences; untouchability case</w:t>
             </w:r>
           </w:p>
         </w:tc>

</xml_diff>